<commit_message>
docs(manual): manual de la 1.0.0
El manual llevaba la versión 0.5 en la portada y en el pie. Regenerado con
`tools/make_manual.py` (VERSION 1.0) y el PDF convertido con LibreOffice Kit.
Aviso de la conversión: sustituye la fuente Courier, que no está instalada.
</commit_message>
<xml_diff>
--- a/docs/DistroForge-Manual.docx
+++ b/docs/DistroForge-Manual.docx
@@ -21,7 +21,7 @@
           <w:color w:val="141C17"/>
           <w:sz w:val="30"/>
         </w:rPr>
-        <w:t>Manual técnico · versión 0.5</w:t>
+        <w:t>Manual técnico · versión 1.0</w:t>
       </w:r>
     </w:p>
     <w:p>
@@ -32,7 +32,7 @@
         </w:rPr>
         <w:t>App web, app de escritorio y backend</w:t>
         <w:br/>
-        <w:t>15/10/2026</w:t>
+        <w:t>17/10/2026</w:t>
         <w:br/>
         <w:br/>
         <w:t>Constructor de distribuciones Linux: de una receta a una ISO, una imagen de disco, un contenedor OCI o una imagen WSL.</w:t>
@@ -2652,7 +2652,7 @@
           <w:color w:val="59655E"/>
           <w:sz w:val="18"/>
         </w:rPr>
-        <w:t>DistroForge 0.5 · documento generado con tools/make_manual.py</w:t>
+        <w:t>DistroForge 1.0 · documento generado con tools/make_manual.py</w:t>
       </w:r>
     </w:p>
     <w:sectPr>

</xml_diff>

<commit_message>
chore: elimina el código heredado (React/TS y Node)
El repositorio se queda solo con la implementación Rust: fuera la app
React/TypeScript, el backend Node y su job de CI. Se regenera el manual
(DOCX + PDF) sin las referencias al código heredado y se alinea el
Cargo.lock del servidor con la 1.0.0.
</commit_message>
<xml_diff>
--- a/docs/DistroForge-Manual.docx
+++ b/docs/DistroForge-Manual.docx
@@ -77,7 +77,7 @@
     </w:p>
     <w:p>
       <w:r>
-        <w:t>Todo el código es Rust desde la v0.4.0. La app React/TypeScript original y el backend Node siguen en legacy/ como referencia y como suite de paridad: el núcleo Rust genera exactamente los mismos ficheros que generaba el núcleo TypeScript.</w:t>
+        <w:t>Todo el código es Rust desde la v0.4.0: la UI web (Leptos/WASM), el núcleo generador, el CLI, el backend (axum) y la app de escritorio (Tauri 2).</w:t>
       </w:r>
     </w:p>
     <w:tbl>
@@ -399,50 +399,6 @@
                 <w:sz w:val="18"/>
               </w:rPr>
               <w:t>App de escritorio que sirve el bundle de la UI.</w:t>
-            </w:r>
-          </w:p>
-        </w:tc>
-      </w:tr>
-      <w:tr>
-        <w:tc>
-          <w:tcPr>
-            <w:tcW w:type="dxa" w:w="1800"/>
-          </w:tcPr>
-          <w:p>
-            <w:r/>
-            <w:r>
-              <w:rPr>
-                <w:sz w:val="18"/>
-              </w:rPr>
-              <w:t>legacy</w:t>
-            </w:r>
-          </w:p>
-        </w:tc>
-        <w:tc>
-          <w:tcPr>
-            <w:tcW w:type="dxa" w:w="2400"/>
-          </w:tcPr>
-          <w:p>
-            <w:r/>
-            <w:r>
-              <w:rPr>
-                <w:sz w:val="18"/>
-              </w:rPr>
-              <w:t>React/TS + Node</w:t>
-            </w:r>
-          </w:p>
-        </w:tc>
-        <w:tc>
-          <w:tcPr>
-            <w:tcW w:type="dxa" w:w="5600"/>
-          </w:tcPr>
-          <w:p>
-            <w:r/>
-            <w:r>
-              <w:rPr>
-                <w:sz w:val="18"/>
-              </w:rPr>
-              <w:t>Referencia y paridad (74 + 8 tests).</w:t>
             </w:r>
           </w:p>
         </w:tc>
@@ -1706,7 +1662,7 @@
     </w:p>
     <w:p>
       <w:r>
-        <w:t>server-rs replica el backend Node en axum. Es opcional: sin él la app funciona entera salvo las funciones de comunidad.</w:t>
+        <w:t>server-rs es el backend, en axum. Es opcional: sin él la app funciona entera salvo las funciones de comunidad.</w:t>
       </w:r>
     </w:p>
     <w:tbl>
@@ -2108,7 +2064,7 @@
               <w:rPr>
                 <w:sz w:val="18"/>
               </w:rPr>
-              <w:t>Núcleo con clippy, backend con tests, UI WASM con Trunk + wasm-opt y la suite legacy</w:t>
+              <w:t>Núcleo con clippy, backend con tests, UI WASM con Trunk + wasm-opt y la interfaz en un navegador real</w:t>
             </w:r>
           </w:p>
         </w:tc>
@@ -2274,7 +2230,7 @@
           <w:rFonts w:ascii="Consolas" w:hAnsi="Consolas"/>
           <w:sz w:val="18"/>
         </w:rPr>
-        <w:t>cd rust &amp;&amp; cargo test -p forge-core          # núcleo + paridad</w:t>
+        <w:t>cd rust &amp;&amp; cargo test -p forge-core          # núcleo</w:t>
       </w:r>
     </w:p>
     <w:p>
@@ -2303,20 +2259,6 @@
           <w:sz w:val="18"/>
         </w:rPr>
         <w:t>cd rust/web-ui &amp;&amp; trunk serve                # UI con recarga</w:t>
-      </w:r>
-    </w:p>
-    <w:p>
-      <w:pPr>
-        <w:spacing w:after="0" w:before="0"/>
-        <w:ind w:left="200"/>
-        <w:shd w:val="clear" w:color="auto" w:fill="F2F5F3"/>
-      </w:pPr>
-      <w:r>
-        <w:rPr>
-          <w:rFonts w:ascii="Consolas" w:hAnsi="Consolas"/>
-          <w:sz w:val="18"/>
-        </w:rPr>
-        <w:t>cd legacy &amp;&amp; npm ci &amp;&amp; npm test              # referencia TypeScript</w:t>
       </w:r>
     </w:p>
     <w:p>
@@ -2363,7 +2305,7 @@
     </w:p>
     <w:p>
       <w:r>
-        <w:t>Para añadir una base nueva: entra en el catálogo del núcleo (forge-core), añade la familia con su gestor de paquetes, su motor y sus valores por defecto, y cubre el caso en los tests de paridad. La UI y el CLI la recogen automáticamente porque ambos leen el mismo catálogo.</w:t>
+        <w:t>Para añadir una base nueva: entra en el catálogo del núcleo (forge-core), añade la familia con su gestor de paquetes, su motor y sus valores por defecto, y cubre el caso en los tests. La UI y el CLI la recogen automáticamente porque ambos leen el mismo catálogo.</w:t>
       </w:r>
     </w:p>
     <w:p>

</xml_diff>

<commit_message>
feat(catálogo): añade Kali, MX, AlmaLinux, Rocky, Oracle, Garuda y SteamOS
El catálogo pasa de 14 a 21 bases, cubriendo las familias que faltaban:
- live-build: Kali Linux (rolling) y MX Linux 23 (Debian bookworm + repo MX).
- kickstart: AlmaLinux 9, Rocky Linux 9 y Oracle Linux 9, con los grupos de dnf
  de la familia RHEL y el kickstart parametrizado por base (directorio, `url`,
  `releasever` y contenedor de livemedia-creator).
- mkarchiso: Garuda Linux (Chaotic-AUR) y SteamOS (repo holo + multilib), con un
  escritorio "modo juego" (Gamescope + Steam) además de KDE.

El `base_image` de OCI conoce las nuevas bases, y las pruebas recorren todas las
bases y todos sus escritorios generando el proyecto y pasando `validate()`.

Docs: README, manual (DOCX/PDF) y CHANGELOG actualizados.
</commit_message>
<xml_diff>
--- a/docs/DistroForge-Manual.docx
+++ b/docs/DistroForge-Manual.docx
@@ -532,7 +532,7 @@
               <w:rPr>
                 <w:sz w:val="18"/>
               </w:rPr>
-              <w:t>Tumbleweed, Leap 16, Slowroll, MicroOS</w:t>
+              <w:t>Tumbleweed, Leap 15.6</w:t>
             </w:r>
           </w:p>
         </w:tc>
@@ -590,7 +590,7 @@
               <w:rPr>
                 <w:sz w:val="18"/>
               </w:rPr>
-              <w:t>Debian 13, Ubuntu 24.04, Mint, elementary, Pop!_OS, Zorin</w:t>
+              <w:t>Debian 12, Ubuntu 24.04, Mint, elementary, Pop!_OS, Zorin, Kali, MX</w:t>
             </w:r>
           </w:p>
         </w:tc>
@@ -648,7 +648,7 @@
               <w:rPr>
                 <w:sz w:val="18"/>
               </w:rPr>
-              <w:t>Arch, Manjaro, CachyOS</w:t>
+              <w:t>Arch, Manjaro, CachyOS, Garuda, SteamOS</w:t>
             </w:r>
           </w:p>
         </w:tc>
@@ -692,7 +692,7 @@
               <w:rPr>
                 <w:sz w:val="18"/>
               </w:rPr>
-              <w:t>Fedora</w:t>
+              <w:t>Fedora / RHEL</w:t>
             </w:r>
           </w:p>
         </w:tc>
@@ -706,7 +706,7 @@
               <w:rPr>
                 <w:sz w:val="18"/>
               </w:rPr>
-              <w:t>Fedora 44</w:t>
+              <w:t>Fedora 44, AlmaLinux 9, Rocky Linux 9, Oracle Linux 9</w:t>
             </w:r>
           </w:p>
         </w:tc>
@@ -1084,7 +1084,7 @@
               <w:rPr>
                 <w:sz w:val="18"/>
               </w:rPr>
-              <w:t>Fedora y derivados</w:t>
+              <w:t>Fedora y clones RHEL</w:t>
             </w:r>
           </w:p>
         </w:tc>

</xml_diff>